<commit_message>
changes to documentation - definitions
</commit_message>
<xml_diff>
--- a/www/How_to_use_visualization.docx
+++ b/www/How_to_use_visualization.docx
@@ -2372,10 +2372,7 @@
         <w:t xml:space="preserve"> panel.</w:t>
       </w:r>
       <w:r>
-        <w:t xml:space="preserve"> </w:t>
-      </w:r>
-      <w:r>
-        <w:t>When selected, the plot panel will appear.</w:t>
+        <w:t xml:space="preserve"> When selected, the plot panel will appear.</w:t>
       </w:r>
     </w:p>
     <w:p>
@@ -2424,7 +2421,13 @@
         <w:t>data</w:t>
       </w:r>
       <w:r>
-        <w:t xml:space="preserve"> can take up to about 20 seconds).</w:t>
+        <w:t xml:space="preserve"> can take up to </w:t>
+      </w:r>
+      <w:r>
+        <w:t>a minute</w:t>
+      </w:r>
+      <w:r>
+        <w:t>).</w:t>
       </w:r>
     </w:p>
     <w:p>

</xml_diff>

<commit_message>
Vis tab What does this page do? updated
</commit_message>
<xml_diff>
--- a/www/How_to_use_visualization.docx
+++ b/www/How_to_use_visualization.docx
@@ -1211,17 +1211,22 @@
       </w:r>
     </w:p>
     <w:p>
+      <w:proofErr w:type="gramStart"/>
       <w:r>
         <w:t>6.</w:t>
       </w:r>
       <w:r>
-        <w:t xml:space="preserve">  </w:t>
-      </w:r>
-      <w:r>
         <w:t xml:space="preserve"> </w:t>
       </w:r>
       <w:r>
-        <w:t xml:space="preserve">(Optional) Click </w:t>
+        <w:t xml:space="preserve"> </w:t>
+      </w:r>
+      <w:r>
+        <w:t>(</w:t>
+      </w:r>
+      <w:proofErr w:type="gramEnd"/>
+      <w:r>
+        <w:t xml:space="preserve">Optional) Click </w:t>
       </w:r>
       <w:r>
         <w:rPr>
@@ -2436,6 +2441,7 @@
       </w:r>
     </w:p>
     <w:p>
+      <w:proofErr w:type="gramStart"/>
       <w:r>
         <w:t>6.</w:t>
       </w:r>
@@ -2443,7 +2449,11 @@
         <w:t xml:space="preserve">  </w:t>
       </w:r>
       <w:r>
-        <w:t xml:space="preserve">(Optional) Click </w:t>
+        <w:t>(</w:t>
+      </w:r>
+      <w:proofErr w:type="gramEnd"/>
+      <w:r>
+        <w:t xml:space="preserve">Optional) Click </w:t>
       </w:r>
       <w:r>
         <w:rPr>
@@ -2465,204 +2475,13 @@
         <mc:AlternateContent>
           <mc:Choice Requires="wps">
             <w:drawing>
-              <wp:anchor distT="0" distB="0" distL="114300" distR="114300" simplePos="0" relativeHeight="251720704" behindDoc="0" locked="0" layoutInCell="1" allowOverlap="1" wp14:anchorId="7B1B6FD6" wp14:editId="209B642B">
+              <wp:anchor distT="0" distB="0" distL="114300" distR="114300" simplePos="0" relativeHeight="251718656" behindDoc="0" locked="0" layoutInCell="1" allowOverlap="1" wp14:anchorId="69967334" wp14:editId="16C647C2">
                 <wp:simplePos x="0" y="0"/>
                 <wp:positionH relativeFrom="column">
-                  <wp:posOffset>1160780</wp:posOffset>
+                  <wp:posOffset>10160</wp:posOffset>
                 </wp:positionH>
                 <wp:positionV relativeFrom="paragraph">
-                  <wp:posOffset>2791460</wp:posOffset>
-                </wp:positionV>
-                <wp:extent cx="368300" cy="385233"/>
-                <wp:effectExtent l="0" t="0" r="0" b="0"/>
-                <wp:wrapNone/>
-                <wp:docPr id="17859203" name="Text Box 28"/>
-                <wp:cNvGraphicFramePr/>
-                <a:graphic xmlns:a="http://schemas.openxmlformats.org/drawingml/2006/main">
-                  <a:graphicData uri="http://schemas.microsoft.com/office/word/2010/wordprocessingShape">
-                    <wps:wsp>
-                      <wps:cNvSpPr txBox="1"/>
-                      <wps:spPr>
-                        <a:xfrm>
-                          <a:off x="0" y="0"/>
-                          <a:ext cx="368300" cy="385233"/>
-                        </a:xfrm>
-                        <a:prstGeom prst="rect">
-                          <a:avLst/>
-                        </a:prstGeom>
-                        <a:noFill/>
-                        <a:ln w="6350">
-                          <a:noFill/>
-                        </a:ln>
-                      </wps:spPr>
-                      <wps:txbx>
-                        <w:txbxContent>
-                          <w:p>
-                            <w:pPr>
-                              <w:rPr>
-                                <w:sz w:val="40"/>
-                                <w:szCs w:val="40"/>
-                              </w:rPr>
-                            </w:pPr>
-                            <w:r>
-                              <w:rPr>
-                                <w:sz w:val="40"/>
-                                <w:szCs w:val="40"/>
-                              </w:rPr>
-                              <w:t>3</w:t>
-                            </w:r>
-                          </w:p>
-                        </w:txbxContent>
-                      </wps:txbx>
-                      <wps:bodyPr rot="0" spcFirstLastPara="0" vertOverflow="overflow" horzOverflow="overflow" vert="horz" wrap="square" lIns="91440" tIns="45720" rIns="91440" bIns="45720" numCol="1" spcCol="0" rtlCol="0" fromWordArt="0" anchor="t" anchorCtr="0" forceAA="0" compatLnSpc="1">
-                        <a:prstTxWarp prst="textNoShape">
-                          <a:avLst/>
-                        </a:prstTxWarp>
-                        <a:noAutofit/>
-                      </wps:bodyPr>
-                    </wps:wsp>
-                  </a:graphicData>
-                </a:graphic>
-              </wp:anchor>
-            </w:drawing>
-          </mc:Choice>
-          <mc:Fallback>
-            <w:pict>
-              <v:shape w14:anchorId="7B1B6FD6" id="_x0000_s1038" type="#_x0000_t202" style="position:absolute;margin-left:91.4pt;margin-top:219.8pt;width:29pt;height:30.35pt;z-index:251720704;visibility:visible;mso-wrap-style:square;mso-wrap-distance-left:9pt;mso-wrap-distance-top:0;mso-wrap-distance-right:9pt;mso-wrap-distance-bottom:0;mso-position-horizontal:absolute;mso-position-horizontal-relative:text;mso-position-vertical:absolute;mso-position-vertical-relative:text;v-text-anchor:top" o:gfxdata="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" filled="f" stroked="f" strokeweight=".5pt">
-                <v:textbox>
-                  <w:txbxContent>
-                    <w:p>
-                      <w:pPr>
-                        <w:rPr>
-                          <w:sz w:val="40"/>
-                          <w:szCs w:val="40"/>
-                        </w:rPr>
-                      </w:pPr>
-                      <w:r>
-                        <w:rPr>
-                          <w:sz w:val="40"/>
-                          <w:szCs w:val="40"/>
-                        </w:rPr>
-                        <w:t>3</w:t>
-                      </w:r>
-                    </w:p>
-                  </w:txbxContent>
-                </v:textbox>
-              </v:shape>
-            </w:pict>
-          </mc:Fallback>
-        </mc:AlternateContent>
-      </w:r>
-      <w:r>
-        <w:rPr>
-          <w:noProof/>
-        </w:rPr>
-        <mc:AlternateContent>
-          <mc:Choice Requires="wps">
-            <w:drawing>
-              <wp:anchor distT="0" distB="0" distL="114300" distR="114300" simplePos="0" relativeHeight="251722752" behindDoc="0" locked="0" layoutInCell="1" allowOverlap="1" wp14:anchorId="1A32B10A" wp14:editId="7E693FAA">
-                <wp:simplePos x="0" y="0"/>
-                <wp:positionH relativeFrom="margin">
-                  <wp:posOffset>116840</wp:posOffset>
-                </wp:positionH>
-                <wp:positionV relativeFrom="paragraph">
-                  <wp:posOffset>3241040</wp:posOffset>
-                </wp:positionV>
-                <wp:extent cx="368300" cy="385233"/>
-                <wp:effectExtent l="0" t="0" r="0" b="0"/>
-                <wp:wrapNone/>
-                <wp:docPr id="133150082" name="Text Box 28"/>
-                <wp:cNvGraphicFramePr/>
-                <a:graphic xmlns:a="http://schemas.openxmlformats.org/drawingml/2006/main">
-                  <a:graphicData uri="http://schemas.microsoft.com/office/word/2010/wordprocessingShape">
-                    <wps:wsp>
-                      <wps:cNvSpPr txBox="1"/>
-                      <wps:spPr>
-                        <a:xfrm>
-                          <a:off x="0" y="0"/>
-                          <a:ext cx="368300" cy="385233"/>
-                        </a:xfrm>
-                        <a:prstGeom prst="rect">
-                          <a:avLst/>
-                        </a:prstGeom>
-                        <a:noFill/>
-                        <a:ln w="6350">
-                          <a:noFill/>
-                        </a:ln>
-                      </wps:spPr>
-                      <wps:txbx>
-                        <w:txbxContent>
-                          <w:p>
-                            <w:pPr>
-                              <w:rPr>
-                                <w:sz w:val="40"/>
-                                <w:szCs w:val="40"/>
-                              </w:rPr>
-                            </w:pPr>
-                            <w:r>
-                              <w:rPr>
-                                <w:sz w:val="40"/>
-                                <w:szCs w:val="40"/>
-                              </w:rPr>
-                              <w:t>4</w:t>
-                            </w:r>
-                          </w:p>
-                        </w:txbxContent>
-                      </wps:txbx>
-                      <wps:bodyPr rot="0" spcFirstLastPara="0" vertOverflow="overflow" horzOverflow="overflow" vert="horz" wrap="square" lIns="91440" tIns="45720" rIns="91440" bIns="45720" numCol="1" spcCol="0" rtlCol="0" fromWordArt="0" anchor="t" anchorCtr="0" forceAA="0" compatLnSpc="1">
-                        <a:prstTxWarp prst="textNoShape">
-                          <a:avLst/>
-                        </a:prstTxWarp>
-                        <a:noAutofit/>
-                      </wps:bodyPr>
-                    </wps:wsp>
-                  </a:graphicData>
-                </a:graphic>
-              </wp:anchor>
-            </w:drawing>
-          </mc:Choice>
-          <mc:Fallback>
-            <w:pict>
-              <v:shape w14:anchorId="1A32B10A" id="_x0000_s1039" type="#_x0000_t202" style="position:absolute;margin-left:9.2pt;margin-top:255.2pt;width:29pt;height:30.35pt;z-index:251722752;visibility:visible;mso-wrap-style:square;mso-wrap-distance-left:9pt;mso-wrap-distance-top:0;mso-wrap-distance-right:9pt;mso-wrap-distance-bottom:0;mso-position-horizontal:absolute;mso-position-horizontal-relative:margin;mso-position-vertical:absolute;mso-position-vertical-relative:text;v-text-anchor:top" o:gfxdata="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" filled="f" stroked="f" strokeweight=".5pt">
-                <v:textbox>
-                  <w:txbxContent>
-                    <w:p>
-                      <w:pPr>
-                        <w:rPr>
-                          <w:sz w:val="40"/>
-                          <w:szCs w:val="40"/>
-                        </w:rPr>
-                      </w:pPr>
-                      <w:r>
-                        <w:rPr>
-                          <w:sz w:val="40"/>
-                          <w:szCs w:val="40"/>
-                        </w:rPr>
-                        <w:t>4</w:t>
-                      </w:r>
-                    </w:p>
-                  </w:txbxContent>
-                </v:textbox>
-                <w10:wrap anchorx="margin"/>
-              </v:shape>
-            </w:pict>
-          </mc:Fallback>
-        </mc:AlternateContent>
-      </w:r>
-      <w:r>
-        <w:rPr>
-          <w:noProof/>
-        </w:rPr>
-        <mc:AlternateContent>
-          <mc:Choice Requires="wps">
-            <w:drawing>
-              <wp:anchor distT="0" distB="0" distL="114300" distR="114300" simplePos="0" relativeHeight="251718656" behindDoc="0" locked="0" layoutInCell="1" allowOverlap="1" wp14:anchorId="69967334" wp14:editId="25DAEEB4">
-                <wp:simplePos x="0" y="0"/>
-                <wp:positionH relativeFrom="column">
-                  <wp:posOffset>124460</wp:posOffset>
-                </wp:positionH>
-                <wp:positionV relativeFrom="paragraph">
-                  <wp:posOffset>2379980</wp:posOffset>
+                  <wp:posOffset>2389505</wp:posOffset>
                 </wp:positionV>
                 <wp:extent cx="368300" cy="385233"/>
                 <wp:effectExtent l="0" t="0" r="0" b="0"/>
@@ -2719,7 +2538,7 @@
           </mc:Choice>
           <mc:Fallback>
             <w:pict>
-              <v:shape w14:anchorId="69967334" id="_x0000_s1040" type="#_x0000_t202" style="position:absolute;margin-left:9.8pt;margin-top:187.4pt;width:29pt;height:30.35pt;z-index:251718656;visibility:visible;mso-wrap-style:square;mso-wrap-distance-left:9pt;mso-wrap-distance-top:0;mso-wrap-distance-right:9pt;mso-wrap-distance-bottom:0;mso-position-horizontal:absolute;mso-position-horizontal-relative:text;mso-position-vertical:absolute;mso-position-vertical-relative:text;v-text-anchor:top" o:gfxdata="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" filled="f" stroked="f" strokeweight=".5pt">
+              <v:shape w14:anchorId="69967334" id="_x0000_s1038" type="#_x0000_t202" style="position:absolute;margin-left:.8pt;margin-top:188.15pt;width:29pt;height:30.35pt;z-index:251718656;visibility:visible;mso-wrap-style:square;mso-wrap-distance-left:9pt;mso-wrap-distance-top:0;mso-wrap-distance-right:9pt;mso-wrap-distance-bottom:0;mso-position-horizontal:absolute;mso-position-horizontal-relative:text;mso-position-vertical:absolute;mso-position-vertical-relative:text;v-text-anchor:top" o:gfxdata="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" filled="f" stroked="f" strokeweight=".5pt">
                 <v:textbox>
                   <w:txbxContent>
                     <w:p>
@@ -2751,113 +2570,18 @@
         <mc:AlternateContent>
           <mc:Choice Requires="wps">
             <w:drawing>
-              <wp:anchor distT="0" distB="0" distL="114300" distR="114300" simplePos="0" relativeHeight="251716608" behindDoc="0" locked="0" layoutInCell="1" allowOverlap="1" wp14:anchorId="3A368519" wp14:editId="2260B1E7">
+              <wp:anchor distT="0" distB="0" distL="114300" distR="114300" simplePos="0" relativeHeight="251710464" behindDoc="0" locked="0" layoutInCell="1" allowOverlap="1" wp14:anchorId="354A264C" wp14:editId="738DEB47">
                 <wp:simplePos x="0" y="0"/>
-                <wp:positionH relativeFrom="column">
-                  <wp:posOffset>1168400</wp:posOffset>
+                <wp:positionH relativeFrom="margin">
+                  <wp:posOffset>-95250</wp:posOffset>
                 </wp:positionH>
                 <wp:positionV relativeFrom="paragraph">
-                  <wp:posOffset>1480820</wp:posOffset>
-                </wp:positionV>
-                <wp:extent cx="368300" cy="385233"/>
-                <wp:effectExtent l="0" t="0" r="0" b="0"/>
-                <wp:wrapNone/>
-                <wp:docPr id="707001424" name="Text Box 28"/>
-                <wp:cNvGraphicFramePr/>
-                <a:graphic xmlns:a="http://schemas.openxmlformats.org/drawingml/2006/main">
-                  <a:graphicData uri="http://schemas.microsoft.com/office/word/2010/wordprocessingShape">
-                    <wps:wsp>
-                      <wps:cNvSpPr txBox="1"/>
-                      <wps:spPr>
-                        <a:xfrm>
-                          <a:off x="0" y="0"/>
-                          <a:ext cx="368300" cy="385233"/>
-                        </a:xfrm>
-                        <a:prstGeom prst="rect">
-                          <a:avLst/>
-                        </a:prstGeom>
-                        <a:noFill/>
-                        <a:ln w="6350">
-                          <a:noFill/>
-                        </a:ln>
-                      </wps:spPr>
-                      <wps:txbx>
-                        <w:txbxContent>
-                          <w:p>
-                            <w:pPr>
-                              <w:rPr>
-                                <w:sz w:val="40"/>
-                                <w:szCs w:val="40"/>
-                              </w:rPr>
-                            </w:pPr>
-                            <w:r>
-                              <w:rPr>
-                                <w:sz w:val="40"/>
-                                <w:szCs w:val="40"/>
-                              </w:rPr>
-                              <w:t>1</w:t>
-                            </w:r>
-                          </w:p>
-                        </w:txbxContent>
-                      </wps:txbx>
-                      <wps:bodyPr rot="0" spcFirstLastPara="0" vertOverflow="overflow" horzOverflow="overflow" vert="horz" wrap="square" lIns="91440" tIns="45720" rIns="91440" bIns="45720" numCol="1" spcCol="0" rtlCol="0" fromWordArt="0" anchor="t" anchorCtr="0" forceAA="0" compatLnSpc="1">
-                        <a:prstTxWarp prst="textNoShape">
-                          <a:avLst/>
-                        </a:prstTxWarp>
-                        <a:noAutofit/>
-                      </wps:bodyPr>
-                    </wps:wsp>
-                  </a:graphicData>
-                </a:graphic>
-              </wp:anchor>
-            </w:drawing>
-          </mc:Choice>
-          <mc:Fallback>
-            <w:pict>
-              <v:shape w14:anchorId="3A368519" id="_x0000_s1041" type="#_x0000_t202" style="position:absolute;margin-left:92pt;margin-top:116.6pt;width:29pt;height:30.35pt;z-index:251716608;visibility:visible;mso-wrap-style:square;mso-wrap-distance-left:9pt;mso-wrap-distance-top:0;mso-wrap-distance-right:9pt;mso-wrap-distance-bottom:0;mso-position-horizontal:absolute;mso-position-horizontal-relative:text;mso-position-vertical:absolute;mso-position-vertical-relative:text;v-text-anchor:top" o:gfxdata="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" filled="f" stroked="f" strokeweight=".5pt">
-                <v:textbox>
-                  <w:txbxContent>
-                    <w:p>
-                      <w:pPr>
-                        <w:rPr>
-                          <w:sz w:val="40"/>
-                          <w:szCs w:val="40"/>
-                        </w:rPr>
-                      </w:pPr>
-                      <w:r>
-                        <w:rPr>
-                          <w:sz w:val="40"/>
-                          <w:szCs w:val="40"/>
-                        </w:rPr>
-                        <w:t>1</w:t>
-                      </w:r>
-                    </w:p>
-                  </w:txbxContent>
-                </v:textbox>
-              </v:shape>
-            </w:pict>
-          </mc:Fallback>
-        </mc:AlternateContent>
-      </w:r>
-      <w:r>
-        <w:rPr>
-          <w:noProof/>
-        </w:rPr>
-        <mc:AlternateContent>
-          <mc:Choice Requires="wps">
-            <w:drawing>
-              <wp:anchor distT="0" distB="0" distL="114300" distR="114300" simplePos="0" relativeHeight="251714560" behindDoc="0" locked="0" layoutInCell="1" allowOverlap="1" wp14:anchorId="3EF09123" wp14:editId="1973E162">
-                <wp:simplePos x="0" y="0"/>
-                <wp:positionH relativeFrom="column">
-                  <wp:posOffset>15240</wp:posOffset>
-                </wp:positionH>
-                <wp:positionV relativeFrom="paragraph">
-                  <wp:posOffset>3176270</wp:posOffset>
+                  <wp:posOffset>2332355</wp:posOffset>
                 </wp:positionV>
                 <wp:extent cx="540000" cy="540000"/>
                 <wp:effectExtent l="0" t="0" r="12700" b="12700"/>
                 <wp:wrapNone/>
-                <wp:docPr id="961042225" name="Oval 26"/>
+                <wp:docPr id="1271415397" name="Oval 26"/>
                 <wp:cNvGraphicFramePr/>
                 <a:graphic xmlns:a="http://schemas.openxmlformats.org/drawingml/2006/main">
                   <a:graphicData uri="http://schemas.microsoft.com/office/word/2010/wordprocessingShape">
@@ -2912,9 +2636,10 @@
           </mc:Choice>
           <mc:Fallback>
             <w:pict>
-              <v:oval w14:anchorId="7CFB90C2" id="Oval 26" o:spid="_x0000_s1026" style="position:absolute;margin-left:1.2pt;margin-top:250.1pt;width:42.5pt;height:42.5pt;z-index:251714560;visibility:visible;mso-wrap-style:square;mso-wrap-distance-left:9pt;mso-wrap-distance-top:0;mso-wrap-distance-right:9pt;mso-wrap-distance-bottom:0;mso-position-horizontal:absolute;mso-position-horizontal-relative:text;mso-position-vertical:absolute;mso-position-vertical-relative:text;v-text-anchor:middle" o:gfxdata="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" fillcolor="black" strokeweight=".35mm">
+              <v:oval w14:anchorId="183BF728" id="Oval 26" o:spid="_x0000_s1026" style="position:absolute;margin-left:-7.5pt;margin-top:183.65pt;width:42.5pt;height:42.5pt;z-index:251710464;visibility:visible;mso-wrap-style:square;mso-wrap-distance-left:9pt;mso-wrap-distance-top:0;mso-wrap-distance-right:9pt;mso-wrap-distance-bottom:0;mso-position-horizontal:absolute;mso-position-horizontal-relative:margin;mso-position-vertical:absolute;mso-position-vertical-relative:text;v-text-anchor:middle" o:gfxdata="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" fillcolor="black" strokeweight=".35mm">
                 <v:fill opacity="3341f"/>
                 <v:stroke joinstyle="miter"/>
+                <w10:wrap anchorx="margin"/>
               </v:oval>
             </w:pict>
           </mc:Fallback>
@@ -2927,18 +2652,119 @@
         <mc:AlternateContent>
           <mc:Choice Requires="wps">
             <w:drawing>
-              <wp:anchor distT="0" distB="0" distL="114300" distR="114300" simplePos="0" relativeHeight="251712512" behindDoc="0" locked="0" layoutInCell="1" allowOverlap="1" wp14:anchorId="51878F9C" wp14:editId="6ABFF5BD">
+              <wp:anchor distT="0" distB="0" distL="114300" distR="114300" simplePos="0" relativeHeight="251726848" behindDoc="0" locked="0" layoutInCell="1" allowOverlap="1" wp14:anchorId="4B4F4E66" wp14:editId="3300C323">
                 <wp:simplePos x="0" y="0"/>
                 <wp:positionH relativeFrom="column">
-                  <wp:posOffset>1036320</wp:posOffset>
+                  <wp:posOffset>1115060</wp:posOffset>
                 </wp:positionH>
                 <wp:positionV relativeFrom="paragraph">
-                  <wp:posOffset>2731135</wp:posOffset>
+                  <wp:posOffset>3871595</wp:posOffset>
+                </wp:positionV>
+                <wp:extent cx="368300" cy="385233"/>
+                <wp:effectExtent l="0" t="0" r="0" b="5715"/>
+                <wp:wrapNone/>
+                <wp:docPr id="1979546262" name="Text Box 28"/>
+                <wp:cNvGraphicFramePr/>
+                <a:graphic xmlns:a="http://schemas.openxmlformats.org/drawingml/2006/main">
+                  <a:graphicData uri="http://schemas.microsoft.com/office/word/2010/wordprocessingShape">
+                    <wps:wsp>
+                      <wps:cNvSpPr txBox="1"/>
+                      <wps:spPr>
+                        <a:xfrm>
+                          <a:off x="0" y="0"/>
+                          <a:ext cx="368300" cy="385233"/>
+                        </a:xfrm>
+                        <a:prstGeom prst="rect">
+                          <a:avLst/>
+                        </a:prstGeom>
+                        <a:noFill/>
+                        <a:ln w="6350">
+                          <a:noFill/>
+                        </a:ln>
+                      </wps:spPr>
+                      <wps:txbx>
+                        <w:txbxContent>
+                          <w:p>
+                            <w:pPr>
+                              <w:rPr>
+                                <w:sz w:val="40"/>
+                                <w:szCs w:val="40"/>
+                              </w:rPr>
+                            </w:pPr>
+                            <w:r>
+                              <w:rPr>
+                                <w:sz w:val="40"/>
+                                <w:szCs w:val="40"/>
+                              </w:rPr>
+                              <w:t>4</w:t>
+                            </w:r>
+                          </w:p>
+                        </w:txbxContent>
+                      </wps:txbx>
+                      <wps:bodyPr rot="0" spcFirstLastPara="0" vertOverflow="overflow" horzOverflow="overflow" vert="horz" wrap="square" lIns="91440" tIns="45720" rIns="91440" bIns="45720" numCol="1" spcCol="0" rtlCol="0" fromWordArt="0" anchor="t" anchorCtr="0" forceAA="0" compatLnSpc="1">
+                        <a:prstTxWarp prst="textNoShape">
+                          <a:avLst/>
+                        </a:prstTxWarp>
+                        <a:noAutofit/>
+                      </wps:bodyPr>
+                    </wps:wsp>
+                  </a:graphicData>
+                </a:graphic>
+                <wp14:sizeRelH relativeFrom="margin">
+                  <wp14:pctWidth>0</wp14:pctWidth>
+                </wp14:sizeRelH>
+                <wp14:sizeRelV relativeFrom="margin">
+                  <wp14:pctHeight>0</wp14:pctHeight>
+                </wp14:sizeRelV>
+              </wp:anchor>
+            </w:drawing>
+          </mc:Choice>
+          <mc:Fallback>
+            <w:pict>
+              <v:shape w14:anchorId="4B4F4E66" id="_x0000_s1039" type="#_x0000_t202" style="position:absolute;margin-left:87.8pt;margin-top:304.85pt;width:29pt;height:30.35pt;z-index:251726848;visibility:visible;mso-wrap-style:square;mso-width-percent:0;mso-height-percent:0;mso-wrap-distance-left:9pt;mso-wrap-distance-top:0;mso-wrap-distance-right:9pt;mso-wrap-distance-bottom:0;mso-position-horizontal:absolute;mso-position-horizontal-relative:text;mso-position-vertical:absolute;mso-position-vertical-relative:text;mso-width-percent:0;mso-height-percent:0;mso-width-relative:margin;mso-height-relative:margin;v-text-anchor:top" o:gfxdata="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" filled="f" stroked="f" strokeweight=".5pt">
+                <v:textbox>
+                  <w:txbxContent>
+                    <w:p>
+                      <w:pPr>
+                        <w:rPr>
+                          <w:sz w:val="40"/>
+                          <w:szCs w:val="40"/>
+                        </w:rPr>
+                      </w:pPr>
+                      <w:r>
+                        <w:rPr>
+                          <w:sz w:val="40"/>
+                          <w:szCs w:val="40"/>
+                        </w:rPr>
+                        <w:t>4</w:t>
+                      </w:r>
+                    </w:p>
+                  </w:txbxContent>
+                </v:textbox>
+              </v:shape>
+            </w:pict>
+          </mc:Fallback>
+        </mc:AlternateContent>
+      </w:r>
+      <w:r>
+        <w:rPr>
+          <w:noProof/>
+        </w:rPr>
+        <mc:AlternateContent>
+          <mc:Choice Requires="wps">
+            <w:drawing>
+              <wp:anchor distT="0" distB="0" distL="114300" distR="114300" simplePos="0" relativeHeight="251724800" behindDoc="0" locked="0" layoutInCell="1" allowOverlap="1" wp14:anchorId="4FF01FCE" wp14:editId="627C7498">
+                <wp:simplePos x="0" y="0"/>
+                <wp:positionH relativeFrom="column">
+                  <wp:posOffset>991235</wp:posOffset>
+                </wp:positionH>
+                <wp:positionV relativeFrom="paragraph">
+                  <wp:posOffset>3810635</wp:posOffset>
                 </wp:positionV>
                 <wp:extent cx="540000" cy="540000"/>
                 <wp:effectExtent l="0" t="0" r="12700" b="12700"/>
                 <wp:wrapNone/>
-                <wp:docPr id="1672857476" name="Oval 26"/>
+                <wp:docPr id="22038828" name="Oval 26"/>
                 <wp:cNvGraphicFramePr/>
                 <a:graphic xmlns:a="http://schemas.openxmlformats.org/drawingml/2006/main">
                   <a:graphicData uri="http://schemas.microsoft.com/office/word/2010/wordprocessingShape">
@@ -2993,7 +2819,7 @@
           </mc:Choice>
           <mc:Fallback>
             <w:pict>
-              <v:oval w14:anchorId="598CAD9C" id="Oval 26" o:spid="_x0000_s1026" style="position:absolute;margin-left:81.6pt;margin-top:215.05pt;width:42.5pt;height:42.5pt;z-index:251712512;visibility:visible;mso-wrap-style:square;mso-wrap-distance-left:9pt;mso-wrap-distance-top:0;mso-wrap-distance-right:9pt;mso-wrap-distance-bottom:0;mso-position-horizontal:absolute;mso-position-horizontal-relative:text;mso-position-vertical:absolute;mso-position-vertical-relative:text;v-text-anchor:middle" o:gfxdata="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" fillcolor="black" strokeweight=".35mm">
+              <v:oval w14:anchorId="6726F89E" id="Oval 26" o:spid="_x0000_s1026" style="position:absolute;margin-left:78.05pt;margin-top:300.05pt;width:42.5pt;height:42.5pt;z-index:251724800;visibility:visible;mso-wrap-style:square;mso-wrap-distance-left:9pt;mso-wrap-distance-top:0;mso-wrap-distance-right:9pt;mso-wrap-distance-bottom:0;mso-position-horizontal:absolute;mso-position-horizontal-relative:text;mso-position-vertical:absolute;mso-position-vertical-relative:text;v-text-anchor:middle" o:gfxdata="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" fillcolor="black" strokeweight=".35mm">
                 <v:fill opacity="3341f"/>
                 <v:stroke joinstyle="miter"/>
               </v:oval>
@@ -3008,18 +2834,119 @@
         <mc:AlternateContent>
           <mc:Choice Requires="wps">
             <w:drawing>
-              <wp:anchor distT="0" distB="0" distL="114300" distR="114300" simplePos="0" relativeHeight="251710464" behindDoc="0" locked="0" layoutInCell="1" allowOverlap="1" wp14:anchorId="354A264C" wp14:editId="468E39B4">
+              <wp:anchor distT="0" distB="0" distL="114300" distR="114300" simplePos="0" relativeHeight="251720704" behindDoc="0" locked="0" layoutInCell="1" allowOverlap="1" wp14:anchorId="7B1B6FD6" wp14:editId="47B37EC7">
                 <wp:simplePos x="0" y="0"/>
-                <wp:positionH relativeFrom="margin">
-                  <wp:align>left</wp:align>
+                <wp:positionH relativeFrom="column">
+                  <wp:posOffset>1113155</wp:posOffset>
                 </wp:positionH>
                 <wp:positionV relativeFrom="paragraph">
-                  <wp:posOffset>2303780</wp:posOffset>
+                  <wp:posOffset>3258185</wp:posOffset>
+                </wp:positionV>
+                <wp:extent cx="368300" cy="385233"/>
+                <wp:effectExtent l="0" t="0" r="0" b="5715"/>
+                <wp:wrapNone/>
+                <wp:docPr id="17859203" name="Text Box 28"/>
+                <wp:cNvGraphicFramePr/>
+                <a:graphic xmlns:a="http://schemas.openxmlformats.org/drawingml/2006/main">
+                  <a:graphicData uri="http://schemas.microsoft.com/office/word/2010/wordprocessingShape">
+                    <wps:wsp>
+                      <wps:cNvSpPr txBox="1"/>
+                      <wps:spPr>
+                        <a:xfrm>
+                          <a:off x="0" y="0"/>
+                          <a:ext cx="368300" cy="385233"/>
+                        </a:xfrm>
+                        <a:prstGeom prst="rect">
+                          <a:avLst/>
+                        </a:prstGeom>
+                        <a:noFill/>
+                        <a:ln w="6350">
+                          <a:noFill/>
+                        </a:ln>
+                      </wps:spPr>
+                      <wps:txbx>
+                        <w:txbxContent>
+                          <w:p>
+                            <w:pPr>
+                              <w:rPr>
+                                <w:sz w:val="40"/>
+                                <w:szCs w:val="40"/>
+                              </w:rPr>
+                            </w:pPr>
+                            <w:r>
+                              <w:rPr>
+                                <w:sz w:val="40"/>
+                                <w:szCs w:val="40"/>
+                              </w:rPr>
+                              <w:t>3</w:t>
+                            </w:r>
+                          </w:p>
+                        </w:txbxContent>
+                      </wps:txbx>
+                      <wps:bodyPr rot="0" spcFirstLastPara="0" vertOverflow="overflow" horzOverflow="overflow" vert="horz" wrap="square" lIns="91440" tIns="45720" rIns="91440" bIns="45720" numCol="1" spcCol="0" rtlCol="0" fromWordArt="0" anchor="t" anchorCtr="0" forceAA="0" compatLnSpc="1">
+                        <a:prstTxWarp prst="textNoShape">
+                          <a:avLst/>
+                        </a:prstTxWarp>
+                        <a:noAutofit/>
+                      </wps:bodyPr>
+                    </wps:wsp>
+                  </a:graphicData>
+                </a:graphic>
+                <wp14:sizeRelH relativeFrom="margin">
+                  <wp14:pctWidth>0</wp14:pctWidth>
+                </wp14:sizeRelH>
+                <wp14:sizeRelV relativeFrom="margin">
+                  <wp14:pctHeight>0</wp14:pctHeight>
+                </wp14:sizeRelV>
+              </wp:anchor>
+            </w:drawing>
+          </mc:Choice>
+          <mc:Fallback>
+            <w:pict>
+              <v:shape w14:anchorId="7B1B6FD6" id="_x0000_s1040" type="#_x0000_t202" style="position:absolute;margin-left:87.65pt;margin-top:256.55pt;width:29pt;height:30.35pt;z-index:251720704;visibility:visible;mso-wrap-style:square;mso-width-percent:0;mso-height-percent:0;mso-wrap-distance-left:9pt;mso-wrap-distance-top:0;mso-wrap-distance-right:9pt;mso-wrap-distance-bottom:0;mso-position-horizontal:absolute;mso-position-horizontal-relative:text;mso-position-vertical:absolute;mso-position-vertical-relative:text;mso-width-percent:0;mso-height-percent:0;mso-width-relative:margin;mso-height-relative:margin;v-text-anchor:top" o:gfxdata="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" filled="f" stroked="f" strokeweight=".5pt">
+                <v:textbox>
+                  <w:txbxContent>
+                    <w:p>
+                      <w:pPr>
+                        <w:rPr>
+                          <w:sz w:val="40"/>
+                          <w:szCs w:val="40"/>
+                        </w:rPr>
+                      </w:pPr>
+                      <w:r>
+                        <w:rPr>
+                          <w:sz w:val="40"/>
+                          <w:szCs w:val="40"/>
+                        </w:rPr>
+                        <w:t>3</w:t>
+                      </w:r>
+                    </w:p>
+                  </w:txbxContent>
+                </v:textbox>
+              </v:shape>
+            </w:pict>
+          </mc:Fallback>
+        </mc:AlternateContent>
+      </w:r>
+      <w:r>
+        <w:rPr>
+          <w:noProof/>
+        </w:rPr>
+        <mc:AlternateContent>
+          <mc:Choice Requires="wps">
+            <w:drawing>
+              <wp:anchor distT="0" distB="0" distL="114300" distR="114300" simplePos="0" relativeHeight="251712512" behindDoc="0" locked="0" layoutInCell="1" allowOverlap="1" wp14:anchorId="51878F9C" wp14:editId="0421FB15">
+                <wp:simplePos x="0" y="0"/>
+                <wp:positionH relativeFrom="column">
+                  <wp:posOffset>998220</wp:posOffset>
+                </wp:positionH>
+                <wp:positionV relativeFrom="paragraph">
+                  <wp:posOffset>3169285</wp:posOffset>
                 </wp:positionV>
                 <wp:extent cx="540000" cy="540000"/>
                 <wp:effectExtent l="0" t="0" r="12700" b="12700"/>
                 <wp:wrapNone/>
-                <wp:docPr id="1271415397" name="Oval 26"/>
+                <wp:docPr id="1672857476" name="Oval 26"/>
                 <wp:cNvGraphicFramePr/>
                 <a:graphic xmlns:a="http://schemas.openxmlformats.org/drawingml/2006/main">
                   <a:graphicData uri="http://schemas.microsoft.com/office/word/2010/wordprocessingShape">
@@ -3074,10 +3001,9 @@
           </mc:Choice>
           <mc:Fallback>
             <w:pict>
-              <v:oval w14:anchorId="49FD0CC2" id="Oval 26" o:spid="_x0000_s1026" style="position:absolute;margin-left:0;margin-top:181.4pt;width:42.5pt;height:42.5pt;z-index:251710464;visibility:visible;mso-wrap-style:square;mso-wrap-distance-left:9pt;mso-wrap-distance-top:0;mso-wrap-distance-right:9pt;mso-wrap-distance-bottom:0;mso-position-horizontal:left;mso-position-horizontal-relative:margin;mso-position-vertical:absolute;mso-position-vertical-relative:text;v-text-anchor:middle" o:gfxdata="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" fillcolor="black" strokeweight=".35mm">
+              <v:oval w14:anchorId="042C879E" id="Oval 26" o:spid="_x0000_s1026" style="position:absolute;margin-left:78.6pt;margin-top:249.55pt;width:42.5pt;height:42.5pt;z-index:251712512;visibility:visible;mso-wrap-style:square;mso-wrap-distance-left:9pt;mso-wrap-distance-top:0;mso-wrap-distance-right:9pt;mso-wrap-distance-bottom:0;mso-position-horizontal:absolute;mso-position-horizontal-relative:text;mso-position-vertical:absolute;mso-position-vertical-relative:text;v-text-anchor:middle" o:gfxdata="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" fillcolor="black" strokeweight=".35mm">
                 <v:fill opacity="3341f"/>
                 <v:stroke joinstyle="miter"/>
-                <w10:wrap anchorx="margin"/>
               </v:oval>
             </w:pict>
           </mc:Fallback>
@@ -3090,18 +3016,114 @@
         <mc:AlternateContent>
           <mc:Choice Requires="wps">
             <w:drawing>
-              <wp:anchor distT="0" distB="0" distL="114300" distR="114300" simplePos="0" relativeHeight="251708416" behindDoc="0" locked="0" layoutInCell="1" allowOverlap="1" wp14:anchorId="658C9409" wp14:editId="2916CD5D">
+              <wp:anchor distT="0" distB="0" distL="114300" distR="114300" simplePos="0" relativeHeight="251722752" behindDoc="0" locked="0" layoutInCell="1" allowOverlap="1" wp14:anchorId="1A32B10A" wp14:editId="5BF961DF">
                 <wp:simplePos x="0" y="0"/>
-                <wp:positionH relativeFrom="column">
-                  <wp:posOffset>1066800</wp:posOffset>
+                <wp:positionH relativeFrom="margin">
+                  <wp:posOffset>97790</wp:posOffset>
                 </wp:positionH>
                 <wp:positionV relativeFrom="paragraph">
-                  <wp:posOffset>1403350</wp:posOffset>
+                  <wp:posOffset>3488690</wp:posOffset>
+                </wp:positionV>
+                <wp:extent cx="368300" cy="385233"/>
+                <wp:effectExtent l="0" t="0" r="0" b="0"/>
+                <wp:wrapNone/>
+                <wp:docPr id="133150082" name="Text Box 28"/>
+                <wp:cNvGraphicFramePr/>
+                <a:graphic xmlns:a="http://schemas.openxmlformats.org/drawingml/2006/main">
+                  <a:graphicData uri="http://schemas.microsoft.com/office/word/2010/wordprocessingShape">
+                    <wps:wsp>
+                      <wps:cNvSpPr txBox="1"/>
+                      <wps:spPr>
+                        <a:xfrm>
+                          <a:off x="0" y="0"/>
+                          <a:ext cx="368300" cy="385233"/>
+                        </a:xfrm>
+                        <a:prstGeom prst="rect">
+                          <a:avLst/>
+                        </a:prstGeom>
+                        <a:noFill/>
+                        <a:ln w="6350">
+                          <a:noFill/>
+                        </a:ln>
+                      </wps:spPr>
+                      <wps:txbx>
+                        <w:txbxContent>
+                          <w:p>
+                            <w:pPr>
+                              <w:rPr>
+                                <w:sz w:val="40"/>
+                                <w:szCs w:val="40"/>
+                              </w:rPr>
+                            </w:pPr>
+                            <w:r>
+                              <w:rPr>
+                                <w:sz w:val="40"/>
+                                <w:szCs w:val="40"/>
+                              </w:rPr>
+                              <w:t>5</w:t>
+                            </w:r>
+                          </w:p>
+                        </w:txbxContent>
+                      </wps:txbx>
+                      <wps:bodyPr rot="0" spcFirstLastPara="0" vertOverflow="overflow" horzOverflow="overflow" vert="horz" wrap="square" lIns="91440" tIns="45720" rIns="91440" bIns="45720" numCol="1" spcCol="0" rtlCol="0" fromWordArt="0" anchor="t" anchorCtr="0" forceAA="0" compatLnSpc="1">
+                        <a:prstTxWarp prst="textNoShape">
+                          <a:avLst/>
+                        </a:prstTxWarp>
+                        <a:noAutofit/>
+                      </wps:bodyPr>
+                    </wps:wsp>
+                  </a:graphicData>
+                </a:graphic>
+              </wp:anchor>
+            </w:drawing>
+          </mc:Choice>
+          <mc:Fallback>
+            <w:pict>
+              <v:shape w14:anchorId="1A32B10A" id="_x0000_s1041" type="#_x0000_t202" style="position:absolute;margin-left:7.7pt;margin-top:274.7pt;width:29pt;height:30.35pt;z-index:251722752;visibility:visible;mso-wrap-style:square;mso-wrap-distance-left:9pt;mso-wrap-distance-top:0;mso-wrap-distance-right:9pt;mso-wrap-distance-bottom:0;mso-position-horizontal:absolute;mso-position-horizontal-relative:margin;mso-position-vertical:absolute;mso-position-vertical-relative:text;v-text-anchor:top" o:gfxdata="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" filled="f" stroked="f" strokeweight=".5pt">
+                <v:textbox>
+                  <w:txbxContent>
+                    <w:p>
+                      <w:pPr>
+                        <w:rPr>
+                          <w:sz w:val="40"/>
+                          <w:szCs w:val="40"/>
+                        </w:rPr>
+                      </w:pPr>
+                      <w:r>
+                        <w:rPr>
+                          <w:sz w:val="40"/>
+                          <w:szCs w:val="40"/>
+                        </w:rPr>
+                        <w:t>5</w:t>
+                      </w:r>
+                    </w:p>
+                  </w:txbxContent>
+                </v:textbox>
+                <w10:wrap anchorx="margin"/>
+              </v:shape>
+            </w:pict>
+          </mc:Fallback>
+        </mc:AlternateContent>
+      </w:r>
+      <w:r>
+        <w:rPr>
+          <w:noProof/>
+        </w:rPr>
+        <mc:AlternateContent>
+          <mc:Choice Requires="wps">
+            <w:drawing>
+              <wp:anchor distT="0" distB="0" distL="114300" distR="114300" simplePos="0" relativeHeight="251714560" behindDoc="0" locked="0" layoutInCell="1" allowOverlap="1" wp14:anchorId="3EF09123" wp14:editId="7F3BB98D">
+                <wp:simplePos x="0" y="0"/>
+                <wp:positionH relativeFrom="margin">
+                  <wp:align>left</wp:align>
+                </wp:positionH>
+                <wp:positionV relativeFrom="paragraph">
+                  <wp:posOffset>3423920</wp:posOffset>
                 </wp:positionV>
                 <wp:extent cx="540000" cy="540000"/>
                 <wp:effectExtent l="0" t="0" r="12700" b="12700"/>
                 <wp:wrapNone/>
-                <wp:docPr id="1442410710" name="Oval 26"/>
+                <wp:docPr id="961042225" name="Oval 26"/>
                 <wp:cNvGraphicFramePr/>
                 <a:graphic xmlns:a="http://schemas.openxmlformats.org/drawingml/2006/main">
                   <a:graphicData uri="http://schemas.microsoft.com/office/word/2010/wordprocessingShape">
@@ -3156,7 +3178,184 @@
           </mc:Choice>
           <mc:Fallback>
             <w:pict>
-              <v:oval w14:anchorId="19B55799" id="Oval 26" o:spid="_x0000_s1026" style="position:absolute;margin-left:84pt;margin-top:110.5pt;width:42.5pt;height:42.5pt;z-index:251708416;visibility:visible;mso-wrap-style:square;mso-wrap-distance-left:9pt;mso-wrap-distance-top:0;mso-wrap-distance-right:9pt;mso-wrap-distance-bottom:0;mso-position-horizontal:absolute;mso-position-horizontal-relative:text;mso-position-vertical:absolute;mso-position-vertical-relative:text;v-text-anchor:middle" o:gfxdata="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" fillcolor="black" strokeweight=".35mm">
+              <v:oval w14:anchorId="500492F9" id="Oval 26" o:spid="_x0000_s1026" style="position:absolute;margin-left:0;margin-top:269.6pt;width:42.5pt;height:42.5pt;z-index:251714560;visibility:visible;mso-wrap-style:square;mso-wrap-distance-left:9pt;mso-wrap-distance-top:0;mso-wrap-distance-right:9pt;mso-wrap-distance-bottom:0;mso-position-horizontal:left;mso-position-horizontal-relative:margin;mso-position-vertical:absolute;mso-position-vertical-relative:text;v-text-anchor:middle" o:gfxdata="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" fillcolor="black" strokeweight=".35mm">
+                <v:fill opacity="3341f"/>
+                <v:stroke joinstyle="miter"/>
+                <w10:wrap anchorx="margin"/>
+              </v:oval>
+            </w:pict>
+          </mc:Fallback>
+        </mc:AlternateContent>
+      </w:r>
+      <w:r>
+        <w:rPr>
+          <w:noProof/>
+        </w:rPr>
+        <mc:AlternateContent>
+          <mc:Choice Requires="wps">
+            <w:drawing>
+              <wp:anchor distT="0" distB="0" distL="114300" distR="114300" simplePos="0" relativeHeight="251716608" behindDoc="0" locked="0" layoutInCell="1" allowOverlap="1" wp14:anchorId="3A368519" wp14:editId="447AC51F">
+                <wp:simplePos x="0" y="0"/>
+                <wp:positionH relativeFrom="column">
+                  <wp:posOffset>1168400</wp:posOffset>
+                </wp:positionH>
+                <wp:positionV relativeFrom="paragraph">
+                  <wp:posOffset>1480820</wp:posOffset>
+                </wp:positionV>
+                <wp:extent cx="368300" cy="385233"/>
+                <wp:effectExtent l="0" t="0" r="0" b="0"/>
+                <wp:wrapNone/>
+                <wp:docPr id="707001424" name="Text Box 28"/>
+                <wp:cNvGraphicFramePr/>
+                <a:graphic xmlns:a="http://schemas.openxmlformats.org/drawingml/2006/main">
+                  <a:graphicData uri="http://schemas.microsoft.com/office/word/2010/wordprocessingShape">
+                    <wps:wsp>
+                      <wps:cNvSpPr txBox="1"/>
+                      <wps:spPr>
+                        <a:xfrm>
+                          <a:off x="0" y="0"/>
+                          <a:ext cx="368300" cy="385233"/>
+                        </a:xfrm>
+                        <a:prstGeom prst="rect">
+                          <a:avLst/>
+                        </a:prstGeom>
+                        <a:noFill/>
+                        <a:ln w="6350">
+                          <a:noFill/>
+                        </a:ln>
+                      </wps:spPr>
+                      <wps:txbx>
+                        <w:txbxContent>
+                          <w:p>
+                            <w:pPr>
+                              <w:rPr>
+                                <w:sz w:val="40"/>
+                                <w:szCs w:val="40"/>
+                              </w:rPr>
+                            </w:pPr>
+                            <w:r>
+                              <w:rPr>
+                                <w:sz w:val="40"/>
+                                <w:szCs w:val="40"/>
+                              </w:rPr>
+                              <w:t>1</w:t>
+                            </w:r>
+                          </w:p>
+                        </w:txbxContent>
+                      </wps:txbx>
+                      <wps:bodyPr rot="0" spcFirstLastPara="0" vertOverflow="overflow" horzOverflow="overflow" vert="horz" wrap="square" lIns="91440" tIns="45720" rIns="91440" bIns="45720" numCol="1" spcCol="0" rtlCol="0" fromWordArt="0" anchor="t" anchorCtr="0" forceAA="0" compatLnSpc="1">
+                        <a:prstTxWarp prst="textNoShape">
+                          <a:avLst/>
+                        </a:prstTxWarp>
+                        <a:noAutofit/>
+                      </wps:bodyPr>
+                    </wps:wsp>
+                  </a:graphicData>
+                </a:graphic>
+              </wp:anchor>
+            </w:drawing>
+          </mc:Choice>
+          <mc:Fallback>
+            <w:pict>
+              <v:shape w14:anchorId="3A368519" id="_x0000_s1042" type="#_x0000_t202" style="position:absolute;margin-left:92pt;margin-top:116.6pt;width:29pt;height:30.35pt;z-index:251716608;visibility:visible;mso-wrap-style:square;mso-wrap-distance-left:9pt;mso-wrap-distance-top:0;mso-wrap-distance-right:9pt;mso-wrap-distance-bottom:0;mso-position-horizontal:absolute;mso-position-horizontal-relative:text;mso-position-vertical:absolute;mso-position-vertical-relative:text;v-text-anchor:top" o:gfxdata="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" filled="f" stroked="f" strokeweight=".5pt">
+                <v:textbox>
+                  <w:txbxContent>
+                    <w:p>
+                      <w:pPr>
+                        <w:rPr>
+                          <w:sz w:val="40"/>
+                          <w:szCs w:val="40"/>
+                        </w:rPr>
+                      </w:pPr>
+                      <w:r>
+                        <w:rPr>
+                          <w:sz w:val="40"/>
+                          <w:szCs w:val="40"/>
+                        </w:rPr>
+                        <w:t>1</w:t>
+                      </w:r>
+                    </w:p>
+                  </w:txbxContent>
+                </v:textbox>
+              </v:shape>
+            </w:pict>
+          </mc:Fallback>
+        </mc:AlternateContent>
+      </w:r>
+      <w:r>
+        <w:rPr>
+          <w:noProof/>
+        </w:rPr>
+        <mc:AlternateContent>
+          <mc:Choice Requires="wps">
+            <w:drawing>
+              <wp:anchor distT="0" distB="0" distL="114300" distR="114300" simplePos="0" relativeHeight="251708416" behindDoc="0" locked="0" layoutInCell="1" allowOverlap="1" wp14:anchorId="658C9409" wp14:editId="1FCF2B37">
+                <wp:simplePos x="0" y="0"/>
+                <wp:positionH relativeFrom="column">
+                  <wp:posOffset>1066800</wp:posOffset>
+                </wp:positionH>
+                <wp:positionV relativeFrom="paragraph">
+                  <wp:posOffset>1403350</wp:posOffset>
+                </wp:positionV>
+                <wp:extent cx="540000" cy="540000"/>
+                <wp:effectExtent l="0" t="0" r="12700" b="12700"/>
+                <wp:wrapNone/>
+                <wp:docPr id="1442410710" name="Oval 26"/>
+                <wp:cNvGraphicFramePr/>
+                <a:graphic xmlns:a="http://schemas.openxmlformats.org/drawingml/2006/main">
+                  <a:graphicData uri="http://schemas.microsoft.com/office/word/2010/wordprocessingShape">
+                    <wps:wsp>
+                      <wps:cNvSpPr/>
+                      <wps:spPr>
+                        <a:xfrm>
+                          <a:off x="0" y="0"/>
+                          <a:ext cx="540000" cy="540000"/>
+                        </a:xfrm>
+                        <a:prstGeom prst="ellipse">
+                          <a:avLst/>
+                        </a:prstGeom>
+                        <a:solidFill>
+                          <a:srgbClr val="000000">
+                            <a:alpha val="5000"/>
+                          </a:srgbClr>
+                        </a:solidFill>
+                        <a:ln w="12600">
+                          <a:solidFill>
+                            <a:srgbClr val="000000"/>
+                          </a:solidFill>
+                        </a:ln>
+                      </wps:spPr>
+                      <wps:style>
+                        <a:lnRef idx="2">
+                          <a:schemeClr val="accent1">
+                            <a:shade val="15000"/>
+                          </a:schemeClr>
+                        </a:lnRef>
+                        <a:fillRef idx="1">
+                          <a:schemeClr val="accent1"/>
+                        </a:fillRef>
+                        <a:effectRef idx="0">
+                          <a:schemeClr val="accent1"/>
+                        </a:effectRef>
+                        <a:fontRef idx="minor">
+                          <a:schemeClr val="lt1"/>
+                        </a:fontRef>
+                      </wps:style>
+                      <wps:bodyPr rot="0" spcFirstLastPara="0" vertOverflow="overflow" horzOverflow="overflow" vert="horz" wrap="square" lIns="91440" tIns="45720" rIns="91440" bIns="45720" numCol="1" spcCol="0" rtlCol="0" fromWordArt="0" anchor="ctr" anchorCtr="0" forceAA="0" compatLnSpc="1">
+                        <a:prstTxWarp prst="textNoShape">
+                          <a:avLst/>
+                        </a:prstTxWarp>
+                        <a:noAutofit/>
+                      </wps:bodyPr>
+                    </wps:wsp>
+                  </a:graphicData>
+                </a:graphic>
+              </wp:anchor>
+            </w:drawing>
+          </mc:Choice>
+          <mc:Fallback>
+            <w:pict>
+              <v:oval w14:anchorId="6260F70D" id="Oval 26" o:spid="_x0000_s1026" style="position:absolute;margin-left:84pt;margin-top:110.5pt;width:42.5pt;height:42.5pt;z-index:251708416;visibility:visible;mso-wrap-style:square;mso-wrap-distance-left:9pt;mso-wrap-distance-top:0;mso-wrap-distance-right:9pt;mso-wrap-distance-bottom:0;mso-position-horizontal:absolute;mso-position-horizontal-relative:text;mso-position-vertical:absolute;mso-position-vertical-relative:text;v-text-anchor:middle" o:gfxdata="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" fillcolor="black" strokeweight=".35mm">
                 <v:fill opacity="3341f"/>
                 <v:stroke joinstyle="miter"/>
               </v:oval>
@@ -3169,10 +3368,10 @@
           <w:noProof/>
         </w:rPr>
         <w:drawing>
-          <wp:inline distT="0" distB="0" distL="0" distR="0" wp14:anchorId="494D374A" wp14:editId="5D082B12">
-            <wp:extent cx="9697720" cy="4836160"/>
-            <wp:effectExtent l="0" t="0" r="0" b="2540"/>
-            <wp:docPr id="329496878" name="Picture 1" descr="A map of the united states&#10;&#10;AI-generated content may be incorrect."/>
+          <wp:inline distT="0" distB="0" distL="0" distR="0" wp14:anchorId="0F84496B" wp14:editId="397DF3BE">
+            <wp:extent cx="9697720" cy="4840605"/>
+            <wp:effectExtent l="0" t="0" r="0" b="0"/>
+            <wp:docPr id="598745217" name="Picture 1" descr="A map of the united states&#10;&#10;AI-generated content may be incorrect."/>
             <wp:cNvGraphicFramePr>
               <a:graphicFrameLocks xmlns:a="http://schemas.openxmlformats.org/drawingml/2006/main" noChangeAspect="1"/>
             </wp:cNvGraphicFramePr>
@@ -3180,7 +3379,7 @@
               <a:graphicData uri="http://schemas.openxmlformats.org/drawingml/2006/picture">
                 <pic:pic xmlns:pic="http://schemas.openxmlformats.org/drawingml/2006/picture">
                   <pic:nvPicPr>
-                    <pic:cNvPr id="329496878" name="Picture 1" descr="A map of the united states&#10;&#10;AI-generated content may be incorrect."/>
+                    <pic:cNvPr id="598745217" name="Picture 1" descr="A map of the united states&#10;&#10;AI-generated content may be incorrect."/>
                     <pic:cNvPicPr/>
                   </pic:nvPicPr>
                   <pic:blipFill>
@@ -3192,7 +3391,7 @@
                   <pic:spPr>
                     <a:xfrm>
                       <a:off x="0" y="0"/>
-                      <a:ext cx="9697720" cy="4836160"/>
+                      <a:ext cx="9697720" cy="4840605"/>
                     </a:xfrm>
                     <a:prstGeom prst="rect">
                       <a:avLst/>
@@ -3257,7 +3456,13 @@
     </w:p>
     <w:p>
       <w:r>
-        <w:t>2.  Select the variable to view.</w:t>
+        <w:t>2.  Select the</w:t>
+      </w:r>
+      <w:r>
+        <w:t xml:space="preserve"> map resolution and the</w:t>
+      </w:r>
+      <w:r>
+        <w:t xml:space="preserve"> variable to view.</w:t>
       </w:r>
       <w:r>
         <w:rPr>
@@ -3267,6 +3472,11 @@
       </w:r>
     </w:p>
     <w:p>
+      <w:pPr>
+        <w:rPr>
+          <w:noProof/>
+        </w:rPr>
+      </w:pPr>
       <w:r>
         <w:t xml:space="preserve">3.  Click </w:t>
       </w:r>
@@ -3289,25 +3499,54 @@
     </w:p>
     <w:p>
       <w:r>
-        <w:t xml:space="preserve">4.  (Optional) Click </w:t>
+        <w:rPr>
+          <w:noProof/>
+        </w:rPr>
+        <w:t xml:space="preserve">4.  (Optional) Zoom in to an area of interest and click </w:t>
       </w:r>
       <w:r>
         <w:rPr>
           <w:b/>
           <w:bCs/>
-        </w:rPr>
-        <w:t>Download</w:t>
-      </w:r>
-      <w:r>
-        <w:t>.</w:t>
+          <w:noProof/>
+        </w:rPr>
+        <w:t>Rescale</w:t>
+      </w:r>
+      <w:r>
+        <w:rPr>
+          <w:noProof/>
+        </w:rPr>
+        <w:t xml:space="preserve"> (the overlay of interest must be loaded first).</w:t>
       </w:r>
     </w:p>
     <w:p>
+      <w:proofErr w:type="gramStart"/>
+      <w:r>
+        <w:t>5</w:t>
+      </w:r>
+      <w:r>
+        <w:t>.  (</w:t>
+      </w:r>
+      <w:proofErr w:type="gramEnd"/>
+      <w:r>
+        <w:t xml:space="preserve">Optional) Click </w:t>
+      </w:r>
+      <w:r>
+        <w:rPr>
+          <w:b/>
+          <w:bCs/>
+        </w:rPr>
+        <w:t>Download</w:t>
+      </w:r>
+      <w:r>
+        <w:t>.</w:t>
+      </w:r>
+    </w:p>
+    <w:p>
       <w:r>
         <w:t>Note: Climate map overlays can be used during Ecoregion/FLP Area/map point selection and plotting.</w:t>
       </w:r>
     </w:p>
-    <w:p/>
     <w:sectPr>
       <w:pgSz w:w="15840" w:h="12240" w:orient="landscape"/>
       <w:pgMar w:top="284" w:right="284" w:bottom="284" w:left="284" w:header="708" w:footer="708" w:gutter="0"/>

</xml_diff>